<commit_message>
Corrección de la justificación de tecnologías de la Fase 1
</commit_message>
<xml_diff>
--- a/Fase 1/Evidencias Grupales/RecyTrack_Justificacion_Tecnologias.docx
+++ b/Fase 1/Evidencias Grupales/RecyTrack_Justificacion_Tecnologias.docx
@@ -852,7 +852,7 @@
         <w:rPr>
           <w:rtl w:val="0"/>
         </w:rPr>
-        <w:t xml:space="preserve">Respecto de la versión presentada en la Fase 1 cambian cuatro decisiones: el backend (reglas de seguridad en lugar de Cloud Functions), el escaneo QR (jsQR), la generación de PDF (pdf-lib) y la forma de distribución (aplicación web instalable en lugar de Expo Go o tiendas de aplicaciones). Las secciones siguientes justifican cada una.</w:t>
+        <w:t xml:space="preserve">Respecto de la propuesta inicial cambian cuatro decisiones: el backend (reglas de seguridad en lugar de Cloud Functions), el escaneo QR (jsQR), la generación de PDF (pdf-lib) y la forma de distribución (aplicación web instalable en lugar de Expo Go o tiendas de aplicaciones). Las secciones siguientes justifican cada una.</w:t>
       </w:r>
     </w:p>
     <w:p>
@@ -1136,7 +1136,7 @@
         <w:rPr>
           <w:rtl w:val="0"/>
         </w:rPr>
-        <w:t xml:space="preserve">La propuesta de la Fase 1 contemplaba Cloud Functions para gobernar las transiciones de estado y emitir los certificados. En la implementación, todas las garantías que el piloto necesita —quién registra, valida y certifica, con qué kilos, en qué contenedor y con qué rol— se expresaron como reglas de seguridad de Firestore. Las reglas se ejecutan en el servidor, se versionan en el repositorio y tienen pruebas automáticas contra el emulador, por lo que nadie puede saltarse una etapa aunque escriba directamente en la base de datos. Además, esto mantiene el proyecto en el plan gratuito de Firebase, coherente con la restricción de no tener presupuesto.</w:t>
+        <w:t xml:space="preserve">La propuesta inicial contemplaba Cloud Functions para gobernar las transiciones de estado y emitir los certificados. En la implementación, todas las garantías que el piloto necesita —quién registra, valida y certifica, con qué kilos, en qué contenedor y con qué rol— se expresaron como reglas de seguridad de Firestore. Las reglas se ejecutan en el servidor, se versionan en el repositorio y tienen pruebas automáticas contra el emulador, por lo que nadie puede saltarse una etapa aunque escriba directamente en la base de datos. Además, esto mantiene el proyecto en el plan gratuito de Firebase, coherente con la restricción de no tener presupuesto.</w:t>
       </w:r>
     </w:p>
     <w:p>

</xml_diff>